<commit_message>
staff attendance and roles added and fix bugs and other components
</commit_message>
<xml_diff>
--- a/translation/docx_templates/character_certificate_ja.docx
+++ b/translation/docx_templates/character_certificate_ja.docx
@@ -322,7 +322,7 @@
           <w:sz w:val="24"/>
           <w:u w:val="none"/>
         </w:rPr>
-        <w:t>{{SCHOOL_NAME}}</w:t>
+        <w:t>{{STUDENT_NAME}}</w:t>
       </w:r>
       <w:r>
         <w:rPr>
@@ -331,7 +331,16 @@
           <w:sz w:val="24"/>
           <w:u w:val="none"/>
         </w:rPr>
-        <w:t>、</w:t>
+        <w:t>氏が</w:t>
+      </w:r>
+      <w:r>
+        <w:rPr>
+          <w:rFonts w:ascii="MS Gothic" w:hAnsi="MS Gothic" w:eastAsia="MS Gothic"/>
+          <w:b w:val="0"/>
+          <w:sz w:val="24"/>
+          <w:u w:val="none"/>
+        </w:rPr>
+        <w:t>{{SCHOOL_NAME}}</w:t>
       </w:r>
       <w:r>
         <w:rPr>
@@ -349,25 +358,7 @@
           <w:sz w:val="24"/>
           <w:u w:val="none"/>
         </w:rPr>
-        <w:t xml:space="preserve"> の</w:t>
-      </w:r>
-      <w:r>
-        <w:rPr>
-          <w:rFonts w:ascii="MS Gothic" w:hAnsi="MS Gothic" w:eastAsia="MS Gothic"/>
-          <w:b w:val="0"/>
-          <w:sz w:val="24"/>
-          <w:u w:val="none"/>
-        </w:rPr>
-        <w:t>{{STUDENT_NAME}}</w:t>
-      </w:r>
-      <w:r>
-        <w:rPr>
-          <w:rFonts w:ascii="MS Gothic" w:hAnsi="MS Gothic" w:eastAsia="MS Gothic"/>
-          <w:b w:val="0"/>
-          <w:sz w:val="24"/>
-          <w:u w:val="none"/>
-        </w:rPr>
-        <w:t xml:space="preserve"> 氏が、ネパール暦</w:t>
+        <w:t>に在籍し、ネパール暦</w:t>
       </w:r>
       <w:r>
         <w:rPr>
@@ -403,7 +394,7 @@
           <w:sz w:val="24"/>
           <w:u w:val="none"/>
         </w:rPr>
-        <w:t>年）に国家試験委員会によって実施された卒業証明書試験（グレード</w:t>
+        <w:t>年）に国家試験委員会が実施した第</w:t>
       </w:r>
       <w:r>
         <w:rPr>
@@ -421,7 +412,7 @@
           <w:sz w:val="24"/>
           <w:u w:val="none"/>
         </w:rPr>
-        <w:t>）を</w:t>
+        <w:t xml:space="preserve">学年修了試験において、GPA </w:t>
       </w:r>
       <w:r>
         <w:rPr>
@@ -439,7 +430,7 @@
           <w:sz w:val="24"/>
           <w:u w:val="none"/>
         </w:rPr>
-        <w:t xml:space="preserve"> GPAで卒業したことを証明するものです。</w:t>
+        <w:t>を取得したことを証明します。</w:t>
       </w:r>
     </w:p>
     <w:p/>

</xml_diff>